<commit_message>
Updated activity A20 write-up to include date of discussion (it took me a while to get the required evidence)
</commit_message>
<xml_diff>
--- a/consent.docx
+++ b/consent.docx
@@ -458,12 +458,23 @@
         </w:rPr>
         <w:t xml:space="preserve">provided it is used solely for the specified purpose (i.e., evidence collection) and nothing else. </w:t>
       </w:r>
+    </w:p>
+    <w:p>
+      <w:pPr>
+        <w:pStyle w:val="ListParagraph"/>
+        <w:numPr>
+          <w:ilvl w:val="0"/>
+          <w:numId w:val="4"/>
+        </w:numPr>
+        <w:rPr>
+          <w:rFonts w:ascii="Atkinson Hyperlegible" w:hAnsi="Atkinson Hyperlegible"/>
+          <w:sz w:val="28"/>
+          <w:szCs w:val="28"/>
+        </w:rPr>
+      </w:pPr>
       <w:r>
         <w:rPr>
-          <w:rFonts w:ascii="Atkinson Hyperlegible" w:hAnsi="Atkinson Hyperlegible"/>
           <w:noProof/>
-          <w:sz w:val="28"/>
-          <w:szCs w:val="28"/>
         </w:rPr>
         <mc:AlternateContent>
           <mc:Choice Requires="wps">
@@ -537,7 +548,7 @@
           </mc:Choice>
           <mc:Fallback>
             <w:pict>
-              <v:shape w14:anchorId="15253ADA" id="Text Box 2" o:spid="_x0000_s1028" type="#_x0000_t202" style="position:absolute;margin-left:337.5pt;margin-top:93.65pt;width:36.5pt;height:21.5pt;z-index:251664384;visibility:visible;mso-wrap-style:square;mso-width-percent:0;mso-height-percent:0;mso-wrap-distance-left:9pt;mso-wrap-distance-top:0;mso-wrap-distance-right:9pt;mso-wrap-distance-bottom:0;mso-position-horizontal:absolute;mso-position-horizontal-relative:text;mso-position-vertical:absolute;mso-position-vertical-relative:text;mso-width-percent:0;mso-height-percent:0;mso-width-relative:margin;mso-height-relative:margin;v-text-anchor:top" o:gfxdata="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" filled="f" stroked="f" strokeweight=".5pt">
+              <v:shape w14:anchorId="15253ADA" id="Text Box 2" o:spid="_x0000_s1028" type="#_x0000_t202" style="position:absolute;left:0;text-align:left;margin-left:337.5pt;margin-top:93.65pt;width:36.5pt;height:21.5pt;z-index:251664384;visibility:visible;mso-wrap-style:square;mso-width-percent:0;mso-height-percent:0;mso-wrap-distance-left:9pt;mso-wrap-distance-top:0;mso-wrap-distance-right:9pt;mso-wrap-distance-bottom:0;mso-position-horizontal:absolute;mso-position-horizontal-relative:text;mso-position-vertical:absolute;mso-position-vertical-relative:text;mso-width-percent:0;mso-height-percent:0;mso-width-relative:margin;mso-height-relative:margin;v-text-anchor:top" o:gfxdata="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" filled="f" stroked="f" strokeweight=".5pt">
                 <v:textbox>
                   <w:txbxContent>
                     <w:p>
@@ -564,10 +575,7 @@
       </w:r>
       <w:r>
         <w:rPr>
-          <w:rFonts w:ascii="Atkinson Hyperlegible" w:hAnsi="Atkinson Hyperlegible"/>
           <w:noProof/>
-          <w:sz w:val="28"/>
-          <w:szCs w:val="28"/>
         </w:rPr>
         <mc:AlternateContent>
           <mc:Choice Requires="wps">
@@ -641,7 +649,7 @@
           </mc:Choice>
           <mc:Fallback>
             <w:pict>
-              <v:shape w14:anchorId="3F36EF9F" id="_x0000_s1029" type="#_x0000_t202" style="position:absolute;margin-left:63pt;margin-top:95.15pt;width:64.5pt;height:22pt;z-index:251662336;visibility:visible;mso-wrap-style:square;mso-width-percent:0;mso-height-percent:0;mso-wrap-distance-left:9pt;mso-wrap-distance-top:0;mso-wrap-distance-right:9pt;mso-wrap-distance-bottom:0;mso-position-horizontal:absolute;mso-position-horizontal-relative:text;mso-position-vertical:absolute;mso-position-vertical-relative:text;mso-width-percent:0;mso-height-percent:0;mso-width-relative:margin;mso-height-relative:margin;v-text-anchor:top" o:gfxdata="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" filled="f" stroked="f" strokeweight=".5pt">
+              <v:shape w14:anchorId="3F36EF9F" id="_x0000_s1029" type="#_x0000_t202" style="position:absolute;left:0;text-align:left;margin-left:63pt;margin-top:95.15pt;width:64.5pt;height:22pt;z-index:251662336;visibility:visible;mso-wrap-style:square;mso-width-percent:0;mso-height-percent:0;mso-wrap-distance-left:9pt;mso-wrap-distance-top:0;mso-wrap-distance-right:9pt;mso-wrap-distance-bottom:0;mso-position-horizontal:absolute;mso-position-horizontal-relative:text;mso-position-vertical:absolute;mso-position-vertical-relative:text;mso-width-percent:0;mso-height-percent:0;mso-width-relative:margin;mso-height-relative:margin;v-text-anchor:top" o:gfxdata="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" filled="f" stroked="f" strokeweight=".5pt">
                 <v:textbox>
                   <w:txbxContent>
                     <w:p>
@@ -668,10 +676,7 @@
       </w:r>
       <w:r>
         <w:rPr>
-          <w:rFonts w:ascii="Atkinson Hyperlegible" w:hAnsi="Atkinson Hyperlegible"/>
           <w:noProof/>
-          <w:sz w:val="28"/>
-          <w:szCs w:val="28"/>
         </w:rPr>
         <mc:AlternateContent>
           <mc:Choice Requires="wps">
@@ -735,10 +740,7 @@
       </w:r>
       <w:r>
         <w:rPr>
-          <w:rFonts w:ascii="Atkinson Hyperlegible" w:hAnsi="Atkinson Hyperlegible"/>
           <w:noProof/>
-          <w:sz w:val="28"/>
-          <w:szCs w:val="28"/>
         </w:rPr>
         <mc:AlternateContent>
           <mc:Choice Requires="wps">
@@ -800,6 +802,14 @@
           </mc:Fallback>
         </mc:AlternateContent>
       </w:r>
+      <w:r>
+        <w:rPr>
+          <w:rFonts w:ascii="Atkinson Hyperlegible" w:hAnsi="Atkinson Hyperlegible"/>
+          <w:sz w:val="28"/>
+          <w:szCs w:val="28"/>
+        </w:rPr>
+        <w:t>I have looked at the materials to be supplied and consent to their release</w:t>
+      </w:r>
     </w:p>
     <w:sectPr>
       <w:pgSz w:w="11906" w:h="16838"/>
@@ -1152,6 +1162,119 @@
       </w:rPr>
     </w:lvl>
   </w:abstractNum>
+  <w:abstractNum w:abstractNumId="3" w15:restartNumberingAfterBreak="0">
+    <w:nsid w:val="7EBF48A5"/>
+    <w:multiLevelType w:val="hybridMultilevel"/>
+    <w:tmpl w:val="4A7E359C"/>
+    <w:lvl w:ilvl="0" w:tplc="BCA802A8">
+      <w:start w:val="1"/>
+      <w:numFmt w:val="bullet"/>
+      <w:lvlText w:val=""/>
+      <w:lvlJc w:val="left"/>
+      <w:pPr>
+        <w:ind w:left="720" w:hanging="360"/>
+      </w:pPr>
+      <w:rPr>
+        <w:rFonts w:ascii="Wingdings" w:hAnsi="Wingdings" w:hint="default"/>
+      </w:rPr>
+    </w:lvl>
+    <w:lvl w:ilvl="1" w:tplc="0C090003" w:tentative="1">
+      <w:start w:val="1"/>
+      <w:numFmt w:val="bullet"/>
+      <w:lvlText w:val="o"/>
+      <w:lvlJc w:val="left"/>
+      <w:pPr>
+        <w:ind w:left="1440" w:hanging="360"/>
+      </w:pPr>
+      <w:rPr>
+        <w:rFonts w:ascii="Courier New" w:hAnsi="Courier New" w:cs="Courier New" w:hint="default"/>
+      </w:rPr>
+    </w:lvl>
+    <w:lvl w:ilvl="2" w:tplc="0C090005" w:tentative="1">
+      <w:start w:val="1"/>
+      <w:numFmt w:val="bullet"/>
+      <w:lvlText w:val=""/>
+      <w:lvlJc w:val="left"/>
+      <w:pPr>
+        <w:ind w:left="2160" w:hanging="360"/>
+      </w:pPr>
+      <w:rPr>
+        <w:rFonts w:ascii="Wingdings" w:hAnsi="Wingdings" w:hint="default"/>
+      </w:rPr>
+    </w:lvl>
+    <w:lvl w:ilvl="3" w:tplc="0C090001" w:tentative="1">
+      <w:start w:val="1"/>
+      <w:numFmt w:val="bullet"/>
+      <w:lvlText w:val=""/>
+      <w:lvlJc w:val="left"/>
+      <w:pPr>
+        <w:ind w:left="2880" w:hanging="360"/>
+      </w:pPr>
+      <w:rPr>
+        <w:rFonts w:ascii="Symbol" w:hAnsi="Symbol" w:hint="default"/>
+      </w:rPr>
+    </w:lvl>
+    <w:lvl w:ilvl="4" w:tplc="0C090003" w:tentative="1">
+      <w:start w:val="1"/>
+      <w:numFmt w:val="bullet"/>
+      <w:lvlText w:val="o"/>
+      <w:lvlJc w:val="left"/>
+      <w:pPr>
+        <w:ind w:left="3600" w:hanging="360"/>
+      </w:pPr>
+      <w:rPr>
+        <w:rFonts w:ascii="Courier New" w:hAnsi="Courier New" w:cs="Courier New" w:hint="default"/>
+      </w:rPr>
+    </w:lvl>
+    <w:lvl w:ilvl="5" w:tplc="0C090005" w:tentative="1">
+      <w:start w:val="1"/>
+      <w:numFmt w:val="bullet"/>
+      <w:lvlText w:val=""/>
+      <w:lvlJc w:val="left"/>
+      <w:pPr>
+        <w:ind w:left="4320" w:hanging="360"/>
+      </w:pPr>
+      <w:rPr>
+        <w:rFonts w:ascii="Wingdings" w:hAnsi="Wingdings" w:hint="default"/>
+      </w:rPr>
+    </w:lvl>
+    <w:lvl w:ilvl="6" w:tplc="0C090001" w:tentative="1">
+      <w:start w:val="1"/>
+      <w:numFmt w:val="bullet"/>
+      <w:lvlText w:val=""/>
+      <w:lvlJc w:val="left"/>
+      <w:pPr>
+        <w:ind w:left="5040" w:hanging="360"/>
+      </w:pPr>
+      <w:rPr>
+        <w:rFonts w:ascii="Symbol" w:hAnsi="Symbol" w:hint="default"/>
+      </w:rPr>
+    </w:lvl>
+    <w:lvl w:ilvl="7" w:tplc="0C090003" w:tentative="1">
+      <w:start w:val="1"/>
+      <w:numFmt w:val="bullet"/>
+      <w:lvlText w:val="o"/>
+      <w:lvlJc w:val="left"/>
+      <w:pPr>
+        <w:ind w:left="5760" w:hanging="360"/>
+      </w:pPr>
+      <w:rPr>
+        <w:rFonts w:ascii="Courier New" w:hAnsi="Courier New" w:cs="Courier New" w:hint="default"/>
+      </w:rPr>
+    </w:lvl>
+    <w:lvl w:ilvl="8" w:tplc="0C090005" w:tentative="1">
+      <w:start w:val="1"/>
+      <w:numFmt w:val="bullet"/>
+      <w:lvlText w:val=""/>
+      <w:lvlJc w:val="left"/>
+      <w:pPr>
+        <w:ind w:left="6480" w:hanging="360"/>
+      </w:pPr>
+      <w:rPr>
+        <w:rFonts w:ascii="Wingdings" w:hAnsi="Wingdings" w:hint="default"/>
+      </w:rPr>
+    </w:lvl>
+  </w:abstractNum>
   <w:num w:numId="1" w16cid:durableId="774129989">
     <w:abstractNumId w:val="0"/>
   </w:num>
@@ -1160,6 +1283,9 @@
   </w:num>
   <w:num w:numId="3" w16cid:durableId="471826419">
     <w:abstractNumId w:val="2"/>
+  </w:num>
+  <w:num w:numId="4" w16cid:durableId="221986229">
+    <w:abstractNumId w:val="3"/>
   </w:num>
 </w:numbering>
 </file>
@@ -1767,6 +1893,7 @@
   <w:style w:type="character" w:default="1" w:styleId="DefaultParagraphFont">
     <w:name w:val="Default Paragraph Font"/>
     <w:uiPriority w:val="1"/>
+    <w:semiHidden/>
     <w:unhideWhenUsed/>
   </w:style>
   <w:style w:type="table" w:default="1" w:styleId="TableNormal">

</xml_diff>